<commit_message>
Commit TOE1 and quarto since link is broken
</commit_message>
<xml_diff>
--- a/_site/Take-home_Ex/Take-home_Ex01b/Take-home_Ex01b.docx
+++ b/_site/Take-home_Ex/Take-home_Ex01b/Take-home_Ex01b.docx
@@ -7,37 +7,7 @@
         <w:pStyle w:val="Title"/>
       </w:pPr>
       <w:r>
-        <w:t xml:space="preserve">Take-home</w:t>
-      </w:r>
-      <w:r>
-        <w:t xml:space="preserve"> </w:t>
-      </w:r>
-      <w:r>
-        <w:t xml:space="preserve">Exercise</w:t>
-      </w:r>
-      <w:r>
-        <w:t xml:space="preserve"> </w:t>
-      </w:r>
-      <w:r>
-        <w:t xml:space="preserve">1b:</w:t>
-      </w:r>
-      <w:r>
-        <w:t xml:space="preserve"> </w:t>
-      </w:r>
-      <w:r>
-        <w:t xml:space="preserve">Data</w:t>
-      </w:r>
-      <w:r>
-        <w:t xml:space="preserve"> </w:t>
-      </w:r>
-      <w:r>
-        <w:t xml:space="preserve">Visualisation</w:t>
-      </w:r>
-      <w:r>
-        <w:t xml:space="preserve"> </w:t>
-      </w:r>
-      <w:r>
-        <w:t xml:space="preserve">Makeover</w:t>
+        <w:t xml:space="preserve">Take-home Exercise 1b: Data Visualisation Makeover</w:t>
       </w:r>
     </w:p>
     <w:p>
@@ -45,13 +15,7 @@
         <w:pStyle w:val="Author"/>
       </w:pPr>
       <w:r>
-        <w:t xml:space="preserve">Belinda</w:t>
-      </w:r>
-      <w:r>
-        <w:t xml:space="preserve"> </w:t>
-      </w:r>
-      <w:r>
-        <w:t xml:space="preserve">Lim</w:t>
+        <w:t xml:space="preserve">Belinda Lim</w:t>
       </w:r>
     </w:p>
     <w:p>
@@ -9014,13 +8978,7 @@
         <w:t xml:space="preserve"> </w:t>
       </w:r>
       <w:r>
-        <w:t xml:space="preserve">“</w:t>
-      </w:r>
-      <w:r>
-        <w:t xml:space="preserve">&gt;100 to 120</w:t>
-      </w:r>
-      <w:r>
-        <w:t xml:space="preserve">”</w:t>
+        <w:t xml:space="preserve">“&gt;100 to 120”</w:t>
       </w:r>
       <w:r>
         <w:t xml:space="preserve">,</w:t>
@@ -9029,13 +8987,7 @@
         <w:t xml:space="preserve"> </w:t>
       </w:r>
       <w:r>
-        <w:t xml:space="preserve">“</w:t>
-      </w:r>
-      <w:r>
-        <w:t xml:space="preserve">&gt;120</w:t>
-      </w:r>
-      <w:r>
-        <w:t xml:space="preserve">”</w:t>
+        <w:t xml:space="preserve">“&gt;120”</w:t>
       </w:r>
       <w:r>
         <w:t xml:space="preserve"> </w:t>
@@ -9047,13 +8999,7 @@
         <w:t xml:space="preserve"> </w:t>
       </w:r>
       <w:r>
-        <w:t xml:space="preserve">“</w:t>
-      </w:r>
-      <w:r>
-        <w:t xml:space="preserve">Not Available</w:t>
-      </w:r>
-      <w:r>
-        <w:t xml:space="preserve">”</w:t>
+        <w:t xml:space="preserve">“Not Available”</w:t>
       </w:r>
       <w:r>
         <w:t xml:space="preserve"> </w:t>
@@ -9065,13 +9011,7 @@
         <w:t xml:space="preserve"> </w:t>
       </w:r>
       <w:r>
-        <w:t xml:space="preserve">“</w:t>
-      </w:r>
-      <w:r>
-        <w:t xml:space="preserve">&gt;80 to 100</w:t>
-      </w:r>
-      <w:r>
-        <w:t xml:space="preserve">”</w:t>
+        <w:t xml:space="preserve">“&gt;80 to 100”</w:t>
       </w:r>
       <w:r>
         <w:t xml:space="preserve">. Hence, I am unable to critique on the good design principles for this chart.</w:t>
@@ -10418,7 +10358,7 @@
   </w:style>
   <w:style w:styleId="Subtitle" w:type="paragraph">
     <w:name w:val="Subtitle"/>
-    <w:basedOn w:val="Normal"/>
+    <w:basedOn w:val="Title"/>
     <w:next w:val="BodyText"/>
     <w:link w:val="SubtitleChar"/>
     <w:uiPriority w:val="11"/>
@@ -10431,7 +10371,6 @@
     </w:pPr>
     <w:rPr>
       <w:rFonts w:cstheme="majorBidi" w:eastAsiaTheme="majorEastAsia"/>
-      <w:color w:themeColor="text1" w:themeTint="A6" w:val="595959"/>
       <w:spacing w:val="15"/>
       <w:sz w:val="28"/>
       <w:szCs w:val="28"/>
@@ -10484,7 +10423,6 @@
     </w:pPr>
     <w:rPr>
       <w:b/>
-      <w:color w:val="345A8A"/>
       <w:sz w:val="20"/>
       <w:szCs w:val="20"/>
     </w:rPr>

</xml_diff>